<commit_message>
feat: carrier all entity
</commit_message>
<xml_diff>
--- a/build/utils/template.docx
+++ b/build/utils/template.docx
@@ -521,8 +521,6 @@
         </w:rPr>
         <w:t>Для собственного потребления и (или) производства</w:t>
       </w:r>
-      <w:bookmarkStart w:id="0" w:name="_GoBack"/>
-      <w:bookmarkEnd w:id="0"/>
     </w:p>
     <w:p>
       <w:pPr>
@@ -867,29 +865,6 @@
       </w:pPr>
       <w:r>
         <w:rPr>
-          <w:sz w:val="18"/>
-          <w:szCs w:val="18"/>
-        </w:rPr>
-        <w:t>При получении товара ОБЯЗАТЕЛЬНО иметь при себе: 1. Паспорт 2. Доверенность 3. Ксерокопию договора, заверенную печатью.</w:t>
-      </w:r>
-    </w:p>
-    <w:p>
-      <w:pPr>
-        <w:rPr>
-          <w:sz w:val="16"/>
-          <w:szCs w:val="16"/>
-        </w:rPr>
-      </w:pPr>
-    </w:p>
-    <w:p>
-      <w:pPr>
-        <w:rPr>
-          <w:sz w:val="16"/>
-          <w:szCs w:val="16"/>
-        </w:rPr>
-      </w:pPr>
-      <w:r>
-        <w:rPr>
           <w:rFonts w:ascii="Times New Roman" w:hAnsi="Times New Roman" w:cs="Times New Roman"/>
           <w:noProof/>
           <w:sz w:val="24"/>
@@ -900,15 +875,15 @@
           <wp:anchor distT="0" distB="0" distL="114300" distR="114300" simplePos="0" relativeHeight="251658240" behindDoc="1" locked="0" layoutInCell="1" allowOverlap="1">
             <wp:simplePos x="0" y="0"/>
             <wp:positionH relativeFrom="column">
-              <wp:posOffset>1550035</wp:posOffset>
+              <wp:posOffset>1016635</wp:posOffset>
             </wp:positionH>
             <wp:positionV relativeFrom="paragraph">
-              <wp:posOffset>8890</wp:posOffset>
+              <wp:posOffset>107315</wp:posOffset>
             </wp:positionV>
-            <wp:extent cx="2190750" cy="1590675"/>
+            <wp:extent cx="2857500" cy="1685925"/>
             <wp:effectExtent l="0" t="0" r="0" b="9525"/>
             <wp:wrapNone/>
-            <wp:docPr id="1" name="Рисунок 1"/>
+            <wp:docPr id="2" name="Рисунок 2"/>
             <wp:cNvGraphicFramePr>
               <a:graphicFrameLocks xmlns:a="http://schemas.openxmlformats.org/drawingml/2006/main" noChangeAspect="1"/>
             </wp:cNvGraphicFramePr>
@@ -916,7 +891,7 @@
               <a:graphicData uri="http://schemas.openxmlformats.org/drawingml/2006/picture">
                 <pic:pic xmlns:pic="http://schemas.openxmlformats.org/drawingml/2006/picture">
                   <pic:nvPicPr>
-                    <pic:cNvPr id="1" name="Безымянный.jpg"/>
+                    <pic:cNvPr id="2" name="печать_V4.png"/>
                     <pic:cNvPicPr/>
                   </pic:nvPicPr>
                   <pic:blipFill>
@@ -934,7 +909,7 @@
                   <pic:spPr>
                     <a:xfrm>
                       <a:off x="0" y="0"/>
-                      <a:ext cx="2190750" cy="1590675"/>
+                      <a:ext cx="2857500" cy="1685925"/>
                     </a:xfrm>
                     <a:prstGeom prst="rect">
                       <a:avLst/>
@@ -952,11 +927,17 @@
           </wp:anchor>
         </w:drawing>
       </w:r>
-    </w:p>
-    <w:p>
-      <w:pPr>
-        <w:rPr>
-          <w:rFonts w:ascii="Times New Roman" w:hAnsi="Times New Roman" w:cs="Times New Roman"/>
+      <w:r>
+        <w:rPr>
+          <w:sz w:val="18"/>
+          <w:szCs w:val="18"/>
+        </w:rPr>
+        <w:t>При получении товара ОБЯЗАТЕЛЬНО иметь при себе: 1. Паспорт 2. Доверенность 3. Ксерокопию договора, заверенную печатью.</w:t>
+      </w:r>
+    </w:p>
+    <w:p>
+      <w:pPr>
+        <w:rPr>
           <w:sz w:val="16"/>
           <w:szCs w:val="16"/>
         </w:rPr>
@@ -965,37 +946,46 @@
     <w:p>
       <w:pPr>
         <w:rPr>
-          <w:rFonts w:ascii="Times New Roman" w:hAnsi="Times New Roman" w:cs="Times New Roman"/>
-          <w:sz w:val="24"/>
-          <w:szCs w:val="24"/>
-        </w:rPr>
-      </w:pPr>
-      <w:r>
-        <w:rPr>
-          <w:rFonts w:ascii="Times New Roman" w:hAnsi="Times New Roman" w:cs="Times New Roman"/>
-          <w:sz w:val="24"/>
-          <w:szCs w:val="24"/>
-        </w:rPr>
-        <w:t xml:space="preserve">Директор                                                                                                          </w:t>
-      </w:r>
-      <w:proofErr w:type="spellStart"/>
-      <w:r>
-        <w:rPr>
-          <w:rFonts w:ascii="Times New Roman" w:hAnsi="Times New Roman" w:cs="Times New Roman"/>
-          <w:sz w:val="24"/>
-          <w:szCs w:val="24"/>
-        </w:rPr>
-        <w:t>Буркун</w:t>
-      </w:r>
-      <w:proofErr w:type="spellEnd"/>
-      <w:r>
-        <w:rPr>
-          <w:rFonts w:ascii="Times New Roman" w:hAnsi="Times New Roman" w:cs="Times New Roman"/>
-          <w:sz w:val="24"/>
-          <w:szCs w:val="24"/>
-        </w:rPr>
-        <w:t xml:space="preserve"> Д.Н.</w:t>
-      </w:r>
+          <w:sz w:val="16"/>
+          <w:szCs w:val="16"/>
+        </w:rPr>
+      </w:pPr>
+    </w:p>
+    <w:p>
+      <w:pPr>
+        <w:rPr>
+          <w:rFonts w:ascii="Times New Roman" w:hAnsi="Times New Roman" w:cs="Times New Roman"/>
+          <w:sz w:val="16"/>
+          <w:szCs w:val="16"/>
+        </w:rPr>
+      </w:pPr>
+    </w:p>
+    <w:p>
+      <w:pPr>
+        <w:rPr>
+          <w:rFonts w:ascii="Times New Roman" w:hAnsi="Times New Roman" w:cs="Times New Roman"/>
+          <w:sz w:val="24"/>
+          <w:szCs w:val="24"/>
+        </w:rPr>
+      </w:pPr>
+      <w:r>
+        <w:rPr>
+          <w:rFonts w:ascii="Times New Roman" w:hAnsi="Times New Roman" w:cs="Times New Roman"/>
+          <w:sz w:val="24"/>
+          <w:szCs w:val="24"/>
+        </w:rPr>
+        <w:t xml:space="preserve">Директор                                                                                     </w:t>
+      </w:r>
+      <w:r>
+        <w:rPr>
+          <w:rFonts w:ascii="Times New Roman" w:hAnsi="Times New Roman" w:cs="Times New Roman"/>
+          <w:sz w:val="24"/>
+          <w:szCs w:val="24"/>
+        </w:rPr>
+        <w:t xml:space="preserve">                     </w:t>
+      </w:r>
+      <w:bookmarkStart w:id="0" w:name="_GoBack"/>
+      <w:bookmarkEnd w:id="0"/>
     </w:p>
     <w:p>
       <w:pPr>

</xml_diff>

<commit_message>
fix: e-mail in check
</commit_message>
<xml_diff>
--- a/build/utils/template.docx
+++ b/build/utils/template.docx
@@ -123,6 +123,7 @@
           <w:b/>
           <w:sz w:val="24"/>
           <w:szCs w:val="24"/>
+          <w:lang w:val="en-US"/>
         </w:rPr>
       </w:pPr>
       <w:r>
@@ -143,6 +144,7 @@
           <w:bCs/>
           <w:sz w:val="24"/>
           <w:szCs w:val="24"/>
+          <w:lang w:val="en-US"/>
         </w:rPr>
         <w:t xml:space="preserve">: </w:t>
       </w:r>
@@ -162,6 +164,7 @@
           <w:b/>
           <w:sz w:val="24"/>
           <w:szCs w:val="24"/>
+          <w:lang w:val="en-US"/>
         </w:rPr>
         <w:t>2</w:t>
       </w:r>
@@ -181,8 +184,28 @@
           <w:b/>
           <w:sz w:val="24"/>
           <w:szCs w:val="24"/>
-        </w:rPr>
-        <w:t>,    УНП:</w:t>
+          <w:lang w:val="en-US"/>
+        </w:rPr>
+        <w:t xml:space="preserve">,    </w:t>
+      </w:r>
+      <w:r>
+        <w:rPr>
+          <w:rFonts w:ascii="Times New Roman" w:hAnsi="Times New Roman" w:cs="Times New Roman"/>
+          <w:b/>
+          <w:sz w:val="24"/>
+          <w:szCs w:val="24"/>
+        </w:rPr>
+        <w:t>УНП</w:t>
+      </w:r>
+      <w:r>
+        <w:rPr>
+          <w:rFonts w:ascii="Times New Roman" w:hAnsi="Times New Roman" w:cs="Times New Roman"/>
+          <w:b/>
+          <w:sz w:val="24"/>
+          <w:szCs w:val="24"/>
+          <w:lang w:val="en-US"/>
+        </w:rPr>
+        <w:t>:</w:t>
       </w:r>
       <w:r>
         <w:rPr>
@@ -190,7 +213,7 @@
           <w:color w:val="000000"/>
           <w:sz w:val="24"/>
           <w:szCs w:val="24"/>
-          <w:lang w:eastAsia="ru-RU"/>
+          <w:lang w:val="en-US" w:eastAsia="ru-RU"/>
         </w:rPr>
         <w:t xml:space="preserve"> </w:t>
       </w:r>
@@ -200,6 +223,7 @@
           <w:b/>
           <w:sz w:val="24"/>
           <w:szCs w:val="24"/>
+          <w:lang w:val="en-US"/>
         </w:rPr>
         <w:t xml:space="preserve">193443791 </w:t>
       </w:r>
@@ -209,6 +233,7 @@
           <w:b/>
           <w:sz w:val="24"/>
           <w:szCs w:val="24"/>
+          <w:lang w:val="en-US"/>
         </w:rPr>
         <w:tab/>
       </w:r>
@@ -224,6 +249,7 @@
         <w:rPr>
           <w:rFonts w:ascii="Times New Roman" w:hAnsi="Times New Roman" w:cs="Times New Roman"/>
           <w:szCs w:val="28"/>
+          <w:lang w:val="en-US"/>
         </w:rPr>
         <w:t>-</w:t>
       </w:r>
@@ -240,10 +266,31 @@
           <w:rFonts w:ascii="Times New Roman" w:hAnsi="Times New Roman" w:cs="Times New Roman"/>
           <w:b/>
           <w:szCs w:val="28"/>
+          <w:lang w:val="en-US"/>
         </w:rPr>
         <w:t xml:space="preserve">: </w:t>
       </w:r>
       <w:hyperlink r:id="rId4" w:history="1">
+        <w:r>
+          <w:rPr>
+            <w:rStyle w:val="a3"/>
+            <w:rFonts w:ascii="Times New Roman" w:hAnsi="Times New Roman" w:cs="Times New Roman"/>
+            <w:b/>
+            <w:szCs w:val="28"/>
+            <w:lang w:val="en-US"/>
+          </w:rPr>
+          <w:t>info</w:t>
+        </w:r>
+        <w:r>
+          <w:rPr>
+            <w:rStyle w:val="a3"/>
+            <w:rFonts w:ascii="Times New Roman" w:hAnsi="Times New Roman" w:cs="Times New Roman"/>
+            <w:b/>
+            <w:szCs w:val="28"/>
+            <w:lang w:val="en-US"/>
+          </w:rPr>
+          <w:t>@</w:t>
+        </w:r>
         <w:r>
           <w:rPr>
             <w:rStyle w:val="a3"/>
@@ -260,25 +307,7 @@
             <w:rFonts w:ascii="Times New Roman" w:hAnsi="Times New Roman" w:cs="Times New Roman"/>
             <w:b/>
             <w:szCs w:val="28"/>
-          </w:rPr>
-          <w:t>@</w:t>
-        </w:r>
-        <w:r>
-          <w:rPr>
-            <w:rStyle w:val="a3"/>
-            <w:rFonts w:ascii="Times New Roman" w:hAnsi="Times New Roman" w:cs="Times New Roman"/>
-            <w:b/>
-            <w:szCs w:val="28"/>
             <w:lang w:val="en-US"/>
-          </w:rPr>
-          <w:t>tut</w:t>
-        </w:r>
-        <w:r>
-          <w:rPr>
-            <w:rStyle w:val="a3"/>
-            <w:rFonts w:ascii="Times New Roman" w:hAnsi="Times New Roman" w:cs="Times New Roman"/>
-            <w:b/>
-            <w:szCs w:val="28"/>
           </w:rPr>
           <w:t>.</w:t>
         </w:r>
@@ -293,6 +322,8 @@
           <w:t>by</w:t>
         </w:r>
       </w:hyperlink>
+      <w:bookmarkStart w:id="0" w:name="_GoBack"/>
+      <w:bookmarkEnd w:id="0"/>
     </w:p>
     <w:p>
       <w:pPr>
@@ -984,8 +1015,6 @@
         </w:rPr>
         <w:t xml:space="preserve">                     </w:t>
       </w:r>
-      <w:bookmarkStart w:id="0" w:name="_GoBack"/>
-      <w:bookmarkEnd w:id="0"/>
     </w:p>
     <w:p>
       <w:pPr>

</xml_diff>